<commit_message>
docx: remove version number from document header and title page
The version number ('v163' was hardcoded, outdated) appeared in both the
running header ('THE FEDERATED REPUBLIC — CONSTITUTION v163') and the
title page ('Version 163'). Version tracking lives in the filename
(constitution-v170.docx) and the changelog — it does not need to appear
inside the document itself.

Header now reads: 'THE FEDERATED REPUBLIC — CONSTITUTION'
Title page date line now reads: 'May 2026'
</commit_message>
<xml_diff>
--- a/constitution-v170.docx
+++ b/constitution-v170.docx
@@ -109,7 +109,7 @@
           <w:sz w:val="22"/>
           <w:szCs w:val="22"/>
         </w:rPr>
-        <w:t xml:space="preserve">Version 163</w:t>
+        <w:t xml:space="preserve">May 2026</w:t>
       </w:r>
     </w:p>
     <w:p>
@@ -22221,7 +22221,7 @@
         <w:sz w:val="16"/>
         <w:szCs w:val="16"/>
       </w:rPr>
-      <w:t xml:space="preserve">THE FEDERATED REPUBLIC — CONSTITUTION v163</w:t>
+      <w:t xml:space="preserve">THE FEDERATED REPUBLIC — CONSTITUTION</w:t>
     </w:r>
   </w:p>
 </w:hdr>

</xml_diff>

<commit_message>
docx: remove duplicate May 2026 date on title page
</commit_message>
<xml_diff>
--- a/constitution-v170.docx
+++ b/constitution-v170.docx
@@ -96,21 +96,6 @@
         <w:spacing w:after="400"/>
         <w:jc w:val="center"/>
       </w:pPr>
-    </w:p>
-    <w:p>
-      <w:pPr>
-        <w:spacing w:after="100"/>
-        <w:jc w:val="center"/>
-      </w:pPr>
-      <w:r>
-        <w:rPr>
-          <w:rFonts w:ascii="Garamond" w:cs="Garamond" w:eastAsia="Garamond" w:hAnsi="Garamond"/>
-          <w:color w:val="7a7060"/>
-          <w:sz w:val="22"/>
-          <w:szCs w:val="22"/>
-        </w:rPr>
-        <w:t xml:space="preserve">May 2026</w:t>
-      </w:r>
     </w:p>
     <w:p>
       <w:pPr>

</xml_diff>